<commit_message>
Instalador de un solo comando (install.sh)
Descarga el proyecto sin git, usa la imagen de ghcr.io si es pública o
la construye en el servidor, crea carpetas e instala la app. README e
instructivo actualizados.

Co-Authored-By: Claude Opus 5.5 <noreply@anthropic.com>
</commit_message>
<xml_diff>
--- a/instalacion/INSTALACION_mya-faceswap.docx
+++ b/instalacion/INSTALACION_mya-faceswap.docx
@@ -437,7 +437,7 @@
               <w:t xml:space="preserve">https://github.com/Vladalan/mya-faceswap</w:t>
             </w:r>
             <w:r>
-              <w:t xml:space="preserve"> (privado)</w:t>
+              <w:t xml:space="preserve"> (público)</w:t>
             </w:r>
           </w:p>
         </w:tc>
@@ -748,47 +748,7 @@
         <w:pStyle w:val="Heading1"/>
       </w:pPr>
       <w:r>
-        <w:t xml:space="preserve">3. Instalación recomendada (desde “Mis aplicaciones”)</w:t>
-      </w:r>
-    </w:p>
-    <w:p>
-      <w:pPr>
-        <w:pStyle w:val="Heading2"/>
-      </w:pPr>
-      <w:r>
-        <w:t xml:space="preserve">3.1 Tener la imagen publicada</w:t>
-      </w:r>
-    </w:p>
-    <w:p>
-      <w:pPr>
-        <w:spacing w:after="120"/>
-      </w:pPr>
-      <w:r>
-        <w:t xml:space="preserve">Cada vez que se sube un cambio a la rama </w:t>
-      </w:r>
-      <w:r>
-        <w:rPr>
-          <w:rFonts w:ascii="Consolas" w:cs="Consolas" w:eastAsia="Consolas" w:hAnsi="Consolas"/>
-          <w:color w:val="7A1F1F"/>
-          <w:sz w:val="19"/>
-          <w:szCs w:val="19"/>
-        </w:rPr>
-        <w:t xml:space="preserve">main</w:t>
-      </w:r>
-      <w:r>
-        <w:t xml:space="preserve">, GitHub Actions construye la imagen y la publica en </w:t>
-      </w:r>
-      <w:r>
-        <w:rPr>
-          <w:rFonts w:ascii="Consolas" w:cs="Consolas" w:eastAsia="Consolas" w:hAnsi="Consolas"/>
-          <w:color w:val="7A1F1F"/>
-          <w:sz w:val="19"/>
-          <w:szCs w:val="19"/>
-        </w:rPr>
-        <w:t xml:space="preserve">ghcr.io</w:t>
-      </w:r>
-      <w:r>
-        <w:t xml:space="preserve">. Para revisarla:</w:t>
+        <w:t xml:space="preserve">3. Instalación (un solo comando)</w:t>
       </w:r>
     </w:p>
     <w:p>
@@ -801,7 +761,17 @@
         <w:spacing w:after="80"/>
       </w:pPr>
       <w:r>
-        <w:t xml:space="preserve">Abre </w:t>
+        <w:t xml:space="preserve">En tu PC abre </w:t>
+      </w:r>
+      <w:r>
+        <w:rPr>
+          <w:b/>
+          <w:bCs/>
+        </w:rPr>
+        <w:t xml:space="preserve">PowerShell</w:t>
+      </w:r>
+      <w:r>
+        <w:t xml:space="preserve"> y entra al servidor: </w:t>
       </w:r>
       <w:r>
         <w:rPr>
@@ -810,20 +780,10 @@
           <w:sz w:val="19"/>
           <w:szCs w:val="19"/>
         </w:rPr>
-        <w:t xml:space="preserve">https://github.com/Vladalan/mya-faceswap/actions</w:t>
-      </w:r>
-      <w:r>
-        <w:t xml:space="preserve"> y verifica que la última ejecución de </w:t>
-      </w:r>
-      <w:r>
-        <w:rPr>
-          <w:b/>
-          <w:bCs/>
-        </w:rPr>
-        <w:t xml:space="preserve">Construir imagen Docker</w:t>
-      </w:r>
-      <w:r>
-        <w:t xml:space="preserve"> esté en verde.</w:t>
+        <w:t xml:space="preserve">ssh Alan@zimaos.tanuki-chimaera.ts.net</w:t>
+      </w:r>
+      <w:r>
+        <w:t xml:space="preserve"> (escribe tu contraseña).</w:t>
       </w:r>
     </w:p>
     <w:p>
@@ -836,67 +796,60 @@
         <w:spacing w:after="80"/>
       </w:pPr>
       <w:r>
-        <w:t xml:space="preserve">Abre </w:t>
-      </w:r>
-      <w:r>
-        <w:rPr>
-          <w:rFonts w:ascii="Consolas" w:cs="Consolas" w:eastAsia="Consolas" w:hAnsi="Consolas"/>
-          <w:color w:val="7A1F1F"/>
-          <w:sz w:val="19"/>
-          <w:szCs w:val="19"/>
-        </w:rPr>
-        <w:t xml:space="preserve">https://github.com/Vladalan?tab=packages</w:t>
-      </w:r>
-      <w:r>
-        <w:t xml:space="preserve"> → </w:t>
+        <w:t xml:space="preserve">Copia y pega este comando y presiona </w:t>
       </w:r>
       <w:r>
         <w:rPr>
           <w:b/>
           <w:bCs/>
         </w:rPr>
-        <w:t xml:space="preserve">mya-faceswap</w:t>
-      </w:r>
-      <w:r>
-        <w:t xml:space="preserve"> → </w:t>
+        <w:t xml:space="preserve">Enter</w:t>
+      </w:r>
+      <w:r>
+        <w:t xml:space="preserve">:</w:t>
+      </w:r>
+    </w:p>
+    <w:p>
+      <w:pPr>
+        <w:shd w:fill="F2F2F2" w:color="auto" w:val="clear"/>
+        <w:spacing w:after="160" w:before="80"/>
+        <w:ind w:left="240" w:right="240"/>
+      </w:pPr>
+      <w:r>
+        <w:rPr>
+          <w:rFonts w:ascii="Consolas" w:cs="Consolas" w:eastAsia="Consolas" w:hAnsi="Consolas"/>
+          <w:sz w:val="18"/>
+          <w:szCs w:val="18"/>
+        </w:rPr>
+        <w:t xml:space="preserve">curl -fsSL https://raw.githubusercontent.com/Vladalan/mya-faceswap/main/install.sh | sudo sh</w:t>
+      </w:r>
+    </w:p>
+    <w:p>
+      <w:pPr>
+        <w:spacing w:after="120"/>
+      </w:pPr>
+      <w:r>
+        <w:t xml:space="preserve">El instalador hace todo solo, en 5 pasos que va mostrando en pantalla: revisa la GPU, descarga el proyecto, obtiene la imagen (la descarga de GitHub si es pública o la construye ahí mismo, </w:t>
       </w:r>
       <w:r>
         <w:rPr>
           <w:b/>
           <w:bCs/>
         </w:rPr>
-        <w:t xml:space="preserve">Package settings</w:t>
-      </w:r>
-      <w:r>
-        <w:t xml:space="preserve"> → </w:t>
+        <w:t xml:space="preserve">10–20 min</w:t>
+      </w:r>
+      <w:r>
+        <w:t xml:space="preserve">), crea las carpetas e instala la app. Al final muestra </w:t>
       </w:r>
       <w:r>
         <w:rPr>
           <w:b/>
           <w:bCs/>
         </w:rPr>
-        <w:t xml:space="preserve">Change visibility</w:t>
-      </w:r>
-      <w:r>
-        <w:t xml:space="preserve"> → </w:t>
-      </w:r>
-      <w:r>
-        <w:rPr>
-          <w:b/>
-          <w:bCs/>
-        </w:rPr>
-        <w:t xml:space="preserve">Public</w:t>
-      </w:r>
-      <w:r>
-        <w:t xml:space="preserve">. Así ZimaOS la descarga sin contraseña. El código del repositorio sigue privado.</w:t>
-      </w:r>
-    </w:p>
-    <w:p>
-      <w:pPr>
-        <w:pStyle w:val="Heading2"/>
-      </w:pPr>
-      <w:r>
-        <w:t xml:space="preserve">3.2 Instalar en ZimaOS</w:t>
+        <w:t xml:space="preserve">✔ Listo</w:t>
+      </w:r>
+      <w:r>
+        <w:t xml:space="preserve"> con las direcciones.</w:t>
       </w:r>
     </w:p>
     <w:p>
@@ -909,7 +862,7 @@
         <w:spacing w:after="80"/>
       </w:pPr>
       <w:r>
-        <w:t xml:space="preserve">Entra a </w:t>
+        <w:t xml:space="preserve">Abre </w:t>
       </w:r>
       <w:r>
         <w:rPr>
@@ -918,86 +871,10 @@
           <w:sz w:val="19"/>
           <w:szCs w:val="19"/>
         </w:rPr>
-        <w:t xml:space="preserve">http://zimaos.tanuki-chimaera.ts.net</w:t>
-      </w:r>
-      <w:r>
-        <w:t xml:space="preserve"> con tu usuario.</w:t>
-      </w:r>
-    </w:p>
-    <w:p>
-      <w:pPr>
-        <w:pStyle w:val="ListParagraph"/>
-        <w:numPr>
-          <w:ilvl w:val="0"/>
-          <w:numId w:val="4"/>
-        </w:numPr>
-        <w:spacing w:after="80"/>
-      </w:pPr>
-      <w:r>
-        <w:t xml:space="preserve">Ve a </w:t>
-      </w:r>
-      <w:r>
-        <w:rPr>
-          <w:b/>
-          <w:bCs/>
-        </w:rPr>
-        <w:t xml:space="preserve">App Store</w:t>
-      </w:r>
-      <w:r>
-        <w:t xml:space="preserve"> (o </w:t>
-      </w:r>
-      <w:r>
-        <w:rPr>
-          <w:b/>
-          <w:bCs/>
-        </w:rPr>
-        <w:t xml:space="preserve">Mis aplicaciones</w:t>
-      </w:r>
-      <w:r>
-        <w:t xml:space="preserve">) → botón </w:t>
-      </w:r>
-      <w:r>
-        <w:rPr>
-          <w:b/>
-          <w:bCs/>
-        </w:rPr>
-        <w:t xml:space="preserve">+</w:t>
-      </w:r>
-      <w:r>
-        <w:t xml:space="preserve"> → </w:t>
-      </w:r>
-      <w:r>
-        <w:rPr>
-          <w:b/>
-          <w:bCs/>
-        </w:rPr>
-        <w:t xml:space="preserve">Install a Custom App</w:t>
-      </w:r>
-      <w:r>
-        <w:t xml:space="preserve">.</w:t>
-      </w:r>
-    </w:p>
-    <w:p>
-      <w:pPr>
-        <w:pStyle w:val="ListParagraph"/>
-        <w:numPr>
-          <w:ilvl w:val="0"/>
-          <w:numId w:val="4"/>
-        </w:numPr>
-        <w:spacing w:after="80"/>
-      </w:pPr>
-      <w:r>
-        <w:t xml:space="preserve">Pulsa el ícono de </w:t>
-      </w:r>
-      <w:r>
-        <w:rPr>
-          <w:b/>
-          <w:bCs/>
-        </w:rPr>
-        <w:t xml:space="preserve">importar</w:t>
-      </w:r>
-      <w:r>
-        <w:t xml:space="preserve"> y pega el contenido completo de </w:t>
+        <w:t xml:space="preserve">http://zimaos.tanuki-chimaera.ts.net:8095</w:t>
+      </w:r>
+      <w:r>
+        <w:t xml:space="preserve"> (interfaz simple) o </w:t>
       </w:r>
       <w:r>
         <w:rPr>
@@ -1006,89 +883,10 @@
           <w:sz w:val="19"/>
           <w:szCs w:val="19"/>
         </w:rPr>
-        <w:t xml:space="preserve">docker-compose.yaml</w:t>
-      </w:r>
-      <w:r>
-        <w:t xml:space="preserve"> del proyecto.</w:t>
-      </w:r>
-    </w:p>
-    <w:p>
-      <w:pPr>
-        <w:pStyle w:val="ListParagraph"/>
-        <w:numPr>
-          <w:ilvl w:val="0"/>
-          <w:numId w:val="4"/>
-        </w:numPr>
-        <w:spacing w:after="80"/>
-      </w:pPr>
-      <w:r>
-        <w:t xml:space="preserve">Revisa que los puertos sean </w:t>
-      </w:r>
-      <w:r>
-        <w:rPr>
-          <w:b/>
-          <w:bCs/>
-        </w:rPr>
-        <w:t xml:space="preserve">8095</w:t>
-      </w:r>
-      <w:r>
-        <w:t xml:space="preserve"> (WEBUI_PORT) y </w:t>
-      </w:r>
-      <w:r>
-        <w:rPr>
-          <w:b/>
-          <w:bCs/>
-        </w:rPr>
-        <w:t xml:space="preserve">7870</w:t>
-      </w:r>
-      <w:r>
-        <w:t xml:space="preserve"> (FF_PORT) y confirma con </w:t>
-      </w:r>
-      <w:r>
-        <w:rPr>
-          <w:b/>
-          <w:bCs/>
-        </w:rPr>
-        <w:t xml:space="preserve">Install</w:t>
-      </w:r>
-      <w:r>
-        <w:t xml:space="preserve">.</w:t>
-      </w:r>
-    </w:p>
-    <w:p>
-      <w:pPr>
-        <w:pStyle w:val="ListParagraph"/>
-        <w:numPr>
-          <w:ilvl w:val="0"/>
-          <w:numId w:val="4"/>
-        </w:numPr>
-        <w:spacing w:after="80"/>
-      </w:pPr>
-      <w:r>
-        <w:t xml:space="preserve">Espera a que termine la descarga de la imagen (~10 GB; la primera vez puede tardar bastante).</w:t>
-      </w:r>
-    </w:p>
-    <w:p>
-      <w:pPr>
-        <w:pStyle w:val="ListParagraph"/>
-        <w:numPr>
-          <w:ilvl w:val="0"/>
-          <w:numId w:val="4"/>
-        </w:numPr>
-        <w:spacing w:after="80"/>
-      </w:pPr>
-      <w:r>
-        <w:t xml:space="preserve">Aparecerá el ícono </w:t>
-      </w:r>
-      <w:r>
-        <w:rPr>
-          <w:b/>
-          <w:bCs/>
-        </w:rPr>
-        <w:t xml:space="preserve">MYA FaceSwap</w:t>
-      </w:r>
-      <w:r>
-        <w:t xml:space="preserve"> en el escritorio de ZimaOS.</w:t>
+        <w:t xml:space="preserve">http://zimaos.tanuki-chimaera.ts.net:7870</w:t>
+      </w:r>
+      <w:r>
+        <w:t xml:space="preserve"> (FaceFusion avanzado).</w:t>
       </w:r>
     </w:p>
     <w:p>
@@ -1111,7 +909,7 @@
         <w:t xml:space="preserve">primera vez que procesas</w:t>
       </w:r>
       <w:r>
-        <w:t xml:space="preserve"> algo, así que el primer trabajo tarda más.</w:t>
+        <w:t xml:space="preserve"> algo, así que el primer trabajo tarda más. Para reinstalar o actualizar, corre el mismo comando otra vez.</w:t>
       </w:r>
     </w:p>
     <w:p>
@@ -1119,7 +917,7 @@
         <w:pStyle w:val="Heading1"/>
       </w:pPr>
       <w:r>
-        <w:t xml:space="preserve">4. Instalación alternativa (por SSH, construyendo en el servidor)</w:t>
+        <w:t xml:space="preserve">4. Instalación alternativa (desde “Mis aplicaciones”)</w:t>
       </w:r>
     </w:p>
     <w:p>
@@ -1127,104 +925,17 @@
         <w:spacing w:after="120"/>
       </w:pPr>
       <w:r>
-        <w:t xml:space="preserve">Útil si no quieres usar la imagen de GitHub. Requiere acceso SSH al servidor.</w:t>
-      </w:r>
-    </w:p>
-    <w:p>
-      <w:pPr>
-        <w:shd w:fill="F2F2F2" w:color="auto" w:val="clear"/>
-        <w:spacing w:after="0" w:before="80"/>
-        <w:ind w:left="240" w:right="240"/>
-      </w:pPr>
-      <w:r>
-        <w:rPr>
-          <w:rFonts w:ascii="Consolas" w:cs="Consolas" w:eastAsia="Consolas" w:hAnsi="Consolas"/>
-          <w:sz w:val="18"/>
-          <w:szCs w:val="18"/>
-        </w:rPr>
-        <w:t xml:space="preserve">ssh Alan@zimaos.tanuki-chimaera.ts.net</w:t>
-      </w:r>
-    </w:p>
-    <w:p>
-      <w:pPr>
-        <w:shd w:fill="F2F2F2" w:color="auto" w:val="clear"/>
-        <w:spacing w:after="0" w:before="0"/>
-        <w:ind w:left="240" w:right="240"/>
-      </w:pPr>
-      <w:r>
-        <w:rPr>
-          <w:rFonts w:ascii="Consolas" w:cs="Consolas" w:eastAsia="Consolas" w:hAnsi="Consolas"/>
-          <w:sz w:val="18"/>
-          <w:szCs w:val="18"/>
-        </w:rPr>
-        <w:t xml:space="preserve">git clone https://github.com/Vladalan/mya-faceswap.git</w:t>
-      </w:r>
-    </w:p>
-    <w:p>
-      <w:pPr>
-        <w:shd w:fill="F2F2F2" w:color="auto" w:val="clear"/>
-        <w:spacing w:after="0" w:before="0"/>
-        <w:ind w:left="240" w:right="240"/>
-      </w:pPr>
-      <w:r>
-        <w:rPr>
-          <w:rFonts w:ascii="Consolas" w:cs="Consolas" w:eastAsia="Consolas" w:hAnsi="Consolas"/>
-          <w:sz w:val="18"/>
-          <w:szCs w:val="18"/>
-        </w:rPr>
-        <w:t xml:space="preserve">cd mya-faceswap</w:t>
-      </w:r>
-    </w:p>
-    <w:p>
-      <w:pPr>
-        <w:shd w:fill="F2F2F2" w:color="auto" w:val="clear"/>
-        <w:spacing w:after="160" w:before="0"/>
-        <w:ind w:left="240" w:right="240"/>
-      </w:pPr>
-      <w:r>
-        <w:rPr>
-          <w:rFonts w:ascii="Consolas" w:cs="Consolas" w:eastAsia="Consolas" w:hAnsi="Consolas"/>
-          <w:sz w:val="18"/>
-          <w:szCs w:val="18"/>
-        </w:rPr>
-        <w:t xml:space="preserve">sh build.sh</w:t>
-      </w:r>
-    </w:p>
-    <w:p>
-      <w:pPr>
-        <w:spacing w:after="120"/>
-      </w:pPr>
-      <w:r>
-        <w:rPr>
-          <w:rFonts w:ascii="Consolas" w:cs="Consolas" w:eastAsia="Consolas" w:hAnsi="Consolas"/>
-          <w:color w:val="7A1F1F"/>
-          <w:sz w:val="19"/>
-          <w:szCs w:val="19"/>
-        </w:rPr>
-        <w:t xml:space="preserve">build.sh</w:t>
-      </w:r>
-      <w:r>
-        <w:t xml:space="preserve"> verifica la GPU, construye la imagen (10–20 min), crea las carpetas en </w:t>
-      </w:r>
-      <w:r>
-        <w:rPr>
-          <w:rFonts w:ascii="Consolas" w:cs="Consolas" w:eastAsia="Consolas" w:hAnsi="Consolas"/>
-          <w:color w:val="7A1F1F"/>
-          <w:sz w:val="19"/>
-          <w:szCs w:val="19"/>
-        </w:rPr>
-        <w:t xml:space="preserve">/DATA</w:t>
-      </w:r>
-      <w:r>
-        <w:t xml:space="preserve"> e instala la app. La imagen local se llama igual que la de GitHub, así que el compose no cambia.</w:t>
-      </w:r>
-    </w:p>
-    <w:p>
-      <w:pPr>
-        <w:pStyle w:val="Heading1"/>
-      </w:pPr>
-      <w:r>
-        <w:t xml:space="preserve">5. Uso</w:t>
+        <w:t xml:space="preserve">Solo funciona si la imagen ya está en el servidor (porque corriste el comando de la sección 3) o si el paquete de GitHub es </w:t>
+      </w:r>
+      <w:r>
+        <w:rPr>
+          <w:b/>
+          <w:bCs/>
+        </w:rPr>
+        <w:t xml:space="preserve">Public</w:t>
+      </w:r>
+      <w:r>
+        <w:t xml:space="preserve">.</w:t>
       </w:r>
     </w:p>
     <w:p>
@@ -1237,7 +948,7 @@
         <w:spacing w:after="80"/>
       </w:pPr>
       <w:r>
-        <w:t xml:space="preserve">Abre </w:t>
+        <w:t xml:space="preserve">Entra a </w:t>
       </w:r>
       <w:r>
         <w:rPr>
@@ -1246,7 +957,37 @@
           <w:sz w:val="19"/>
           <w:szCs w:val="19"/>
         </w:rPr>
-        <w:t xml:space="preserve">http://zimaos.tanuki-chimaera.ts.net:8095</w:t>
+        <w:t xml:space="preserve">http://zimaos.tanuki-chimaera.ts.net</w:t>
+      </w:r>
+      <w:r>
+        <w:t xml:space="preserve"> → </w:t>
+      </w:r>
+      <w:r>
+        <w:rPr>
+          <w:b/>
+          <w:bCs/>
+        </w:rPr>
+        <w:t xml:space="preserve">App Store</w:t>
+      </w:r>
+      <w:r>
+        <w:t xml:space="preserve"> → botón </w:t>
+      </w:r>
+      <w:r>
+        <w:rPr>
+          <w:b/>
+          <w:bCs/>
+        </w:rPr>
+        <w:t xml:space="preserve">+</w:t>
+      </w:r>
+      <w:r>
+        <w:t xml:space="preserve"> → </w:t>
+      </w:r>
+      <w:r>
+        <w:rPr>
+          <w:b/>
+          <w:bCs/>
+        </w:rPr>
+        <w:t xml:space="preserve">Install a Custom App</w:t>
       </w:r>
       <w:r>
         <w:t xml:space="preserve">.</w:t>
@@ -1262,17 +1003,97 @@
         <w:spacing w:after="80"/>
       </w:pPr>
       <w:r>
-        <w:t xml:space="preserve">En </w:t>
+        <w:t xml:space="preserve">Importa o pega el contenido de </w:t>
+      </w:r>
+      <w:r>
+        <w:rPr>
+          <w:rFonts w:ascii="Consolas" w:cs="Consolas" w:eastAsia="Consolas" w:hAnsi="Consolas"/>
+          <w:color w:val="7A1F1F"/>
+          <w:sz w:val="19"/>
+          <w:szCs w:val="19"/>
+        </w:rPr>
+        <w:t xml:space="preserve">docker-compose.yaml</w:t>
+      </w:r>
+      <w:r>
+        <w:t xml:space="preserve"> del proyecto y pulsa </w:t>
       </w:r>
       <w:r>
         <w:rPr>
           <w:b/>
           <w:bCs/>
         </w:rPr>
-        <w:t xml:space="preserve">1. Rostro(s) fuente</w:t>
-      </w:r>
-      <w:r>
-        <w:t xml:space="preserve"> sube una o varias fotos claras de la misma persona.</w:t>
+        <w:t xml:space="preserve">Install</w:t>
+      </w:r>
+      <w:r>
+        <w:t xml:space="preserve">.</w:t>
+      </w:r>
+    </w:p>
+    <w:p>
+      <w:pPr>
+        <w:spacing w:after="120"/>
+      </w:pPr>
+      <w:r>
+        <w:t xml:space="preserve">Para hacer pública la imagen: </w:t>
+      </w:r>
+      <w:r>
+        <w:rPr>
+          <w:rFonts w:ascii="Consolas" w:cs="Consolas" w:eastAsia="Consolas" w:hAnsi="Consolas"/>
+          <w:color w:val="7A1F1F"/>
+          <w:sz w:val="19"/>
+          <w:szCs w:val="19"/>
+        </w:rPr>
+        <w:t xml:space="preserve">https://github.com/users/Vladalan/packages/container/mya-faceswap/settings</w:t>
+      </w:r>
+      <w:r>
+        <w:t xml:space="preserve"> → </w:t>
+      </w:r>
+      <w:r>
+        <w:rPr>
+          <w:b/>
+          <w:bCs/>
+        </w:rPr>
+        <w:t xml:space="preserve">Danger Zone</w:t>
+      </w:r>
+      <w:r>
+        <w:t xml:space="preserve"> → </w:t>
+      </w:r>
+      <w:r>
+        <w:rPr>
+          <w:b/>
+          <w:bCs/>
+        </w:rPr>
+        <w:t xml:space="preserve">Change visibility</w:t>
+      </w:r>
+      <w:r>
+        <w:t xml:space="preserve"> → </w:t>
+      </w:r>
+      <w:r>
+        <w:rPr>
+          <w:b/>
+          <w:bCs/>
+        </w:rPr>
+        <w:t xml:space="preserve">Public</w:t>
+      </w:r>
+      <w:r>
+        <w:t xml:space="preserve">. Ojo: es la página del </w:t>
+      </w:r>
+      <w:r>
+        <w:rPr>
+          <w:b/>
+          <w:bCs/>
+        </w:rPr>
+        <w:t xml:space="preserve">paquete</w:t>
+      </w:r>
+      <w:r>
+        <w:t xml:space="preserve">, no la del repositorio.</w:t>
+      </w:r>
+    </w:p>
+    <w:p>
+      <w:pPr>
+        <w:pStyle w:val="Heading1"/>
+      </w:pPr>
+      <w:r>
+        <w:t xml:space="preserve">5. Uso</w:t>
       </w:r>
     </w:p>
     <w:p>
@@ -1280,22 +1101,24 @@
         <w:pStyle w:val="ListParagraph"/>
         <w:numPr>
           <w:ilvl w:val="0"/>
-          <w:numId w:val="5"/>
+          <w:numId w:val="6"/>
         </w:numPr>
         <w:spacing w:after="80"/>
       </w:pPr>
       <w:r>
-        <w:t xml:space="preserve">En </w:t>
-      </w:r>
-      <w:r>
-        <w:rPr>
-          <w:b/>
-          <w:bCs/>
-        </w:rPr>
-        <w:t xml:space="preserve">2. Imagen o video objetivo</w:t>
-      </w:r>
-      <w:r>
-        <w:t xml:space="preserve"> sube el archivo donde va el rostro.</w:t>
+        <w:t xml:space="preserve">Abre </w:t>
+      </w:r>
+      <w:r>
+        <w:rPr>
+          <w:rFonts w:ascii="Consolas" w:cs="Consolas" w:eastAsia="Consolas" w:hAnsi="Consolas"/>
+          <w:color w:val="7A1F1F"/>
+          <w:sz w:val="19"/>
+          <w:szCs w:val="19"/>
+        </w:rPr>
+        <w:t xml:space="preserve">http://zimaos.tanuki-chimaera.ts.net:8095</w:t>
+      </w:r>
+      <w:r>
+        <w:t xml:space="preserve">.</w:t>
       </w:r>
     </w:p>
     <w:p>
@@ -1303,7 +1126,7 @@
         <w:pStyle w:val="ListParagraph"/>
         <w:numPr>
           <w:ilvl w:val="0"/>
-          <w:numId w:val="5"/>
+          <w:numId w:val="6"/>
         </w:numPr>
         <w:spacing w:after="80"/>
       </w:pPr>
@@ -1315,10 +1138,10 @@
           <w:b/>
           <w:bCs/>
         </w:rPr>
-        <w:t xml:space="preserve">Opciones</w:t>
-      </w:r>
-      <w:r>
-        <w:t xml:space="preserve"> puedes elegir el modelo (HyperSwap 1a es el recomendado), activar la mejora de rostro y reemplazar todas las caras.</w:t>
+        <w:t xml:space="preserve">1. Rostro(s) fuente</w:t>
+      </w:r>
+      <w:r>
+        <w:t xml:space="preserve"> sube una o varias fotos claras de la misma persona.</w:t>
       </w:r>
     </w:p>
     <w:p>
@@ -1326,32 +1149,22 @@
         <w:pStyle w:val="ListParagraph"/>
         <w:numPr>
           <w:ilvl w:val="0"/>
-          <w:numId w:val="5"/>
+          <w:numId w:val="6"/>
         </w:numPr>
         <w:spacing w:after="80"/>
       </w:pPr>
       <w:r>
-        <w:t xml:space="preserve">Marca la casilla de </w:t>
+        <w:t xml:space="preserve">En </w:t>
       </w:r>
       <w:r>
         <w:rPr>
           <w:b/>
           <w:bCs/>
         </w:rPr>
-        <w:t xml:space="preserve">consentimiento</w:t>
-      </w:r>
-      <w:r>
-        <w:t xml:space="preserve"> y pulsa </w:t>
-      </w:r>
-      <w:r>
-        <w:rPr>
-          <w:b/>
-          <w:bCs/>
-        </w:rPr>
-        <w:t xml:space="preserve">Procesar</w:t>
-      </w:r>
-      <w:r>
-        <w:t xml:space="preserve">.</w:t>
+        <w:t xml:space="preserve">2. Imagen o video objetivo</w:t>
+      </w:r>
+      <w:r>
+        <w:t xml:space="preserve"> sube el archivo donde va el rostro.</w:t>
       </w:r>
     </w:p>
     <w:p>
@@ -1359,7 +1172,63 @@
         <w:pStyle w:val="ListParagraph"/>
         <w:numPr>
           <w:ilvl w:val="0"/>
-          <w:numId w:val="5"/>
+          <w:numId w:val="6"/>
+        </w:numPr>
+        <w:spacing w:after="80"/>
+      </w:pPr>
+      <w:r>
+        <w:t xml:space="preserve">En </w:t>
+      </w:r>
+      <w:r>
+        <w:rPr>
+          <w:b/>
+          <w:bCs/>
+        </w:rPr>
+        <w:t xml:space="preserve">Opciones</w:t>
+      </w:r>
+      <w:r>
+        <w:t xml:space="preserve"> puedes elegir el modelo (HyperSwap 1a es el recomendado), activar la mejora de rostro y reemplazar todas las caras.</w:t>
+      </w:r>
+    </w:p>
+    <w:p>
+      <w:pPr>
+        <w:pStyle w:val="ListParagraph"/>
+        <w:numPr>
+          <w:ilvl w:val="0"/>
+          <w:numId w:val="6"/>
+        </w:numPr>
+        <w:spacing w:after="80"/>
+      </w:pPr>
+      <w:r>
+        <w:t xml:space="preserve">Marca la casilla de </w:t>
+      </w:r>
+      <w:r>
+        <w:rPr>
+          <w:b/>
+          <w:bCs/>
+        </w:rPr>
+        <w:t xml:space="preserve">consentimiento</w:t>
+      </w:r>
+      <w:r>
+        <w:t xml:space="preserve"> y pulsa </w:t>
+      </w:r>
+      <w:r>
+        <w:rPr>
+          <w:b/>
+          <w:bCs/>
+        </w:rPr>
+        <w:t xml:space="preserve">Procesar</w:t>
+      </w:r>
+      <w:r>
+        <w:t xml:space="preserve">.</w:t>
+      </w:r>
+    </w:p>
+    <w:p>
+      <w:pPr>
+        <w:pStyle w:val="ListParagraph"/>
+        <w:numPr>
+          <w:ilvl w:val="0"/>
+          <w:numId w:val="6"/>
         </w:numPr>
         <w:spacing w:after="80"/>
       </w:pPr>
@@ -1712,7 +1581,7 @@
         <w:pStyle w:val="ListParagraph"/>
         <w:numPr>
           <w:ilvl w:val="0"/>
-          <w:numId w:val="6"/>
+          <w:numId w:val="7"/>
         </w:numPr>
         <w:spacing w:after="80"/>
       </w:pPr>
@@ -1773,7 +1642,7 @@
         <w:pStyle w:val="ListParagraph"/>
         <w:numPr>
           <w:ilvl w:val="0"/>
-          <w:numId w:val="6"/>
+          <w:numId w:val="7"/>
         </w:numPr>
         <w:spacing w:after="80"/>
       </w:pPr>
@@ -1798,22 +1667,12 @@
         <w:pStyle w:val="ListParagraph"/>
         <w:numPr>
           <w:ilvl w:val="0"/>
-          <w:numId w:val="6"/>
+          <w:numId w:val="7"/>
         </w:numPr>
         <w:spacing w:after="80"/>
       </w:pPr>
       <w:r>
-        <w:t xml:space="preserve">En ZimaOS, abre la app → </w:t>
-      </w:r>
-      <w:r>
-        <w:rPr>
-          <w:b/>
-          <w:bCs/>
-        </w:rPr>
-        <w:t xml:space="preserve">Ajustes</w:t>
-      </w:r>
-      <w:r>
-        <w:t xml:space="preserve"> → actualiza el compose con el tag nuevo y guarda.</w:t>
+        <w:t xml:space="preserve">En el servidor, corre otra vez el comando de instalación (sección 3).</w:t>
       </w:r>
     </w:p>
     <w:p>
@@ -1966,7 +1825,13 @@
           </w:tcPr>
           <w:p>
             <w:r>
-              <w:t xml:space="preserve">ZimaOS no puede descargar la imagen</w:t>
+              <w:rPr>
+                <w:rFonts w:ascii="Consolas" w:cs="Consolas" w:eastAsia="Consolas" w:hAnsi="Consolas"/>
+                <w:color w:val="7A1F1F"/>
+                <w:sz w:val="19"/>
+                <w:szCs w:val="19"/>
+              </w:rPr>
+              <w:t xml:space="preserve">ERROR: No se detecta la GPU</w:t>
             </w:r>
           </w:p>
         </w:tc>
@@ -1988,17 +1853,62 @@
           </w:tcPr>
           <w:p>
             <w:r>
-              <w:t xml:space="preserve">Revisa que el paquete en ghcr.io sea </w:t>
-            </w:r>
+              <w:t xml:space="preserve">Activa los drivers NVIDIA en ZimaOS (Ajustes → GPU) y corre otra vez el comando.</w:t>
+            </w:r>
+          </w:p>
+        </w:tc>
+      </w:tr>
+      <w:tr>
+        <w:tc>
+          <w:tcPr>
+            <w:tcW w:type="dxa" w:w="3600"/>
+            <w:tcBorders>
+              <w:top w:val="single" w:color="BFBFBF" w:sz="4"/>
+              <w:left w:val="single" w:color="BFBFBF" w:sz="4"/>
+              <w:bottom w:val="single" w:color="BFBFBF" w:sz="4"/>
+              <w:right w:val="single" w:color="BFBFBF" w:sz="4"/>
+            </w:tcBorders>
+            <w:tcMar>
+              <w:top w:type="dxa" w:w="60"/>
+              <w:left w:type="dxa" w:w="100"/>
+              <w:bottom w:type="dxa" w:w="60"/>
+              <w:right w:type="dxa" w:w="100"/>
+            </w:tcMar>
+          </w:tcPr>
+          <w:p>
             <w:r>
               <w:rPr>
-                <w:b/>
-                <w:bCs/>
+                <w:rFonts w:ascii="Consolas" w:cs="Consolas" w:eastAsia="Consolas" w:hAnsi="Consolas"/>
+                <w:color w:val="7A1F1F"/>
+                <w:sz w:val="19"/>
+                <w:szCs w:val="19"/>
               </w:rPr>
-              <w:t xml:space="preserve">Public</w:t>
-            </w:r>
-            <w:r>
-              <w:t xml:space="preserve"> (paso 3.1).</w:t>
+              <w:t xml:space="preserve">curl: command not found</w:t>
+            </w:r>
+            <w:r>
+              <w:t xml:space="preserve"> o sin internet</w:t>
+            </w:r>
+          </w:p>
+        </w:tc>
+        <w:tc>
+          <w:tcPr>
+            <w:tcW w:type="dxa" w:w="5760"/>
+            <w:tcBorders>
+              <w:top w:val="single" w:color="BFBFBF" w:sz="4"/>
+              <w:left w:val="single" w:color="BFBFBF" w:sz="4"/>
+              <w:bottom w:val="single" w:color="BFBFBF" w:sz="4"/>
+              <w:right w:val="single" w:color="BFBFBF" w:sz="4"/>
+            </w:tcBorders>
+            <w:tcMar>
+              <w:top w:type="dxa" w:w="60"/>
+              <w:left w:type="dxa" w:w="100"/>
+              <w:bottom w:type="dxa" w:w="60"/>
+              <w:right w:type="dxa" w:w="100"/>
+            </w:tcMar>
+          </w:tcPr>
+          <w:p>
+            <w:r>
+              <w:t xml:space="preserve">Revisa la conexión del servidor; el instalador necesita descargar de GitHub.</w:t>
             </w:r>
           </w:p>
         </w:tc>
@@ -2219,7 +2129,7 @@
         <w:sz w:val="16"/>
         <w:szCs w:val="16"/>
       </w:rPr>
-      <w:t xml:space="preserve"> · Actualizado 20 de octubre de 2026</w:t>
+      <w:t xml:space="preserve"> · Actualizado 21 de octubre de 2026</w:t>
     </w:r>
   </w:p>
 </w:ftr>
@@ -2421,6 +2331,12 @@
     </w:lvlOverride>
   </w:num>
   <w:num w:numId="6">
+    <w:abstractNumId w:val="3"/>
+    <w:lvlOverride w:ilvl="0">
+      <w:startOverride w:val="1"/>
+    </w:lvlOverride>
+  </w:num>
+  <w:num w:numId="7">
     <w:abstractNumId w:val="3"/>
     <w:lvlOverride w:ilvl="0">
       <w:startOverride w:val="1"/>

</xml_diff>